<commit_message>
Updated documentation and added final project files
</commit_message>
<xml_diff>
--- a/Documentation/Retail_Sales_Data_Engineering_Project_Report.docx
+++ b/Documentation/Retail_Sales_Data_Engineering_Project_Report.docx
@@ -261,16 +261,11 @@
         </w:rPr>
       </w:pPr>
       <w:r>
-        <w:t xml:space="preserve">Duplicate transaction records were removed after </w:t>
-      </w:r>
-      <w:proofErr w:type="gramStart"/>
-      <w:r>
-        <w:t>validation</w:t>
+        <w:t>Duplicate transaction records were removed after validation</w:t>
       </w:r>
       <w:r>
         <w:t xml:space="preserve"> :</w:t>
       </w:r>
-      <w:proofErr w:type="gramEnd"/>
       <w:r>
         <w:br/>
       </w:r>
@@ -307,16 +302,11 @@
         </w:rPr>
       </w:pPr>
       <w:r>
-        <w:t xml:space="preserve">Negative and zero quantities were </w:t>
-      </w:r>
-      <w:proofErr w:type="gramStart"/>
-      <w:r>
-        <w:t>excluded</w:t>
+        <w:t>Negative and zero quantities were excluded</w:t>
       </w:r>
       <w:r>
         <w:t xml:space="preserve"> :</w:t>
       </w:r>
-      <w:proofErr w:type="gramEnd"/>
       <w:r>
         <w:br/>
       </w:r>
@@ -614,7 +604,10 @@
         <w:pStyle w:val="Heading1"/>
       </w:pPr>
       <w:r>
-        <w:t>7. Architecture</w:t>
+        <w:t xml:space="preserve">7. </w:t>
+      </w:r>
+      <w:r>
+        <w:t>Data Flow Diagram</w:t>
       </w:r>
     </w:p>
     <w:p>
@@ -622,14 +615,11 @@
         <w:br/>
       </w:r>
       <w:r>
-        <w:rPr>
-          <w:noProof/>
-        </w:rPr>
         <w:drawing>
-          <wp:inline distT="0" distB="0" distL="0" distR="0" wp14:anchorId="36B7AB58" wp14:editId="3829F4DA">
-            <wp:extent cx="2140527" cy="4087090"/>
-            <wp:effectExtent l="0" t="0" r="0" b="0"/>
-            <wp:docPr id="2058945628" name="Picture 1"/>
+          <wp:inline distT="0" distB="0" distL="0" distR="0" wp14:anchorId="5E45EC95" wp14:editId="2CB7033C">
+            <wp:extent cx="2849880" cy="4292600"/>
+            <wp:effectExtent l="0" t="0" r="7620" b="0"/>
+            <wp:docPr id="1536543983" name="Picture 1"/>
             <wp:cNvGraphicFramePr>
               <a:graphicFrameLocks xmlns:a="http://schemas.openxmlformats.org/drawingml/2006/main" noChangeAspect="1"/>
             </wp:cNvGraphicFramePr>
@@ -637,11 +627,11 @@
               <a:graphicData uri="http://schemas.openxmlformats.org/drawingml/2006/picture">
                 <pic:pic xmlns:pic="http://schemas.openxmlformats.org/drawingml/2006/picture">
                   <pic:nvPicPr>
-                    <pic:cNvPr id="2058945628" name=""/>
+                    <pic:cNvPr id="1536543983" name=""/>
                     <pic:cNvPicPr/>
                   </pic:nvPicPr>
                   <pic:blipFill>
-                    <a:blip r:embed="rId6"/>
+                    <a:blip r:embed="rId8"/>
                     <a:stretch>
                       <a:fillRect/>
                     </a:stretch>
@@ -649,7 +639,7 @@
                   <pic:spPr>
                     <a:xfrm>
                       <a:off x="0" y="0"/>
-                      <a:ext cx="2144037" cy="4093792"/>
+                      <a:ext cx="2850130" cy="4292977"/>
                     </a:xfrm>
                     <a:prstGeom prst="rect">
                       <a:avLst/>
@@ -663,6 +653,61 @@
       </w:r>
     </w:p>
     <w:p>
+      <w:pPr>
+        <w:pStyle w:val="Heading1"/>
+      </w:pPr>
+      <w:r>
+        <w:lastRenderedPageBreak/>
+        <w:t>7.1. Architecture Diagram</w:t>
+      </w:r>
+    </w:p>
+    <w:p>
+      <w:pPr>
+        <w:pStyle w:val="Heading1"/>
+      </w:pPr>
+      <w:r>
+        <w:drawing>
+          <wp:inline distT="0" distB="0" distL="0" distR="0" wp14:anchorId="369C4655" wp14:editId="3D273BD6">
+            <wp:extent cx="2004060" cy="3003550"/>
+            <wp:effectExtent l="0" t="0" r="0" b="6350"/>
+            <wp:docPr id="2048496039" name="Picture 1"/>
+            <wp:cNvGraphicFramePr>
+              <a:graphicFrameLocks xmlns:a="http://schemas.openxmlformats.org/drawingml/2006/main" noChangeAspect="1"/>
+            </wp:cNvGraphicFramePr>
+            <a:graphic xmlns:a="http://schemas.openxmlformats.org/drawingml/2006/main">
+              <a:graphicData uri="http://schemas.openxmlformats.org/drawingml/2006/picture">
+                <pic:pic xmlns:pic="http://schemas.openxmlformats.org/drawingml/2006/picture">
+                  <pic:nvPicPr>
+                    <pic:cNvPr id="2048496039" name=""/>
+                    <pic:cNvPicPr/>
+                  </pic:nvPicPr>
+                  <pic:blipFill>
+                    <a:blip r:embed="rId9"/>
+                    <a:stretch>
+                      <a:fillRect/>
+                    </a:stretch>
+                  </pic:blipFill>
+                  <pic:spPr>
+                    <a:xfrm>
+                      <a:off x="0" y="0"/>
+                      <a:ext cx="2004238" cy="3003817"/>
+                    </a:xfrm>
+                    <a:prstGeom prst="rect">
+                      <a:avLst/>
+                    </a:prstGeom>
+                  </pic:spPr>
+                </pic:pic>
+              </a:graphicData>
+            </a:graphic>
+          </wp:inline>
+        </w:drawing>
+      </w:r>
+      <w:r>
+        <w:t xml:space="preserve"> </w:t>
+      </w:r>
+    </w:p>
+    <w:p/>
+    <w:p>
       <w:r>
         <w:t>The architecture represents the complete data engineering workflow followed in this project. Retail sales data from multiple sheets (</w:t>
       </w:r>
@@ -796,7 +841,14 @@
         <w:rPr>
           <w:lang w:val="en-IN"/>
         </w:rPr>
-        <w:t xml:space="preserve"> indicates that customers make relatively high-value purchases, contributing significantly to overall revenue growth. Product-level analysis identified </w:t>
+        <w:t xml:space="preserve"> indicates that customers make relatively high-value purchases, contributing significantly to overall revenue growth. Product-level </w:t>
+      </w:r>
+      <w:r>
+        <w:rPr>
+          <w:lang w:val="en-IN"/>
+        </w:rPr>
+        <w:lastRenderedPageBreak/>
+        <w:t xml:space="preserve">analysis identified </w:t>
       </w:r>
       <w:r>
         <w:rPr>
@@ -828,7 +880,9 @@
     </w:p>
     <w:p>
       <w:r>
-        <w:lastRenderedPageBreak/>
+        <w:rPr>
+          <w:noProof/>
+        </w:rPr>
         <w:drawing>
           <wp:inline distT="0" distB="0" distL="0" distR="0" wp14:anchorId="594F89E4" wp14:editId="5FE44408">
             <wp:extent cx="5708650" cy="3197239"/>
@@ -845,7 +899,7 @@
                     <pic:cNvPicPr/>
                   </pic:nvPicPr>
                   <pic:blipFill>
-                    <a:blip r:embed="rId7"/>
+                    <a:blip r:embed="rId10"/>
                     <a:stretch>
                       <a:fillRect/>
                     </a:stretch>
@@ -868,6 +922,9 @@
     </w:p>
     <w:p>
       <w:r>
+        <w:rPr>
+          <w:noProof/>
+        </w:rPr>
         <w:drawing>
           <wp:inline distT="0" distB="0" distL="0" distR="0" wp14:anchorId="4DA4E76F" wp14:editId="3E96BB81">
             <wp:extent cx="5669280" cy="3174534"/>
@@ -884,7 +941,7 @@
                     <pic:cNvPicPr/>
                   </pic:nvPicPr>
                   <pic:blipFill>
-                    <a:blip r:embed="rId8"/>
+                    <a:blip r:embed="rId11"/>
                     <a:stretch>
                       <a:fillRect/>
                     </a:stretch>
@@ -910,6 +967,7 @@
         <w:pStyle w:val="Heading1"/>
       </w:pPr>
       <w:r>
+        <w:lastRenderedPageBreak/>
         <w:t>10. Key Business Insights</w:t>
       </w:r>
     </w:p>
@@ -957,7 +1015,6 @@
         <w:rPr>
           <w:lang w:val="en-IN"/>
         </w:rPr>
-        <w:lastRenderedPageBreak/>
         <w:t xml:space="preserve">The </w:t>
       </w:r>
       <w:r>
@@ -1220,11 +1277,13 @@
       </w:pPr>
       <w:r>
         <w:rPr>
+          <w:noProof/>
           <w:lang w:val="en-IN"/>
         </w:rPr>
+        <w:lastRenderedPageBreak/>
         <w:drawing>
-          <wp:inline distT="0" distB="0" distL="0" distR="0" wp14:anchorId="785C6230" wp14:editId="78304DC6">
-            <wp:extent cx="5486400" cy="2635250"/>
+          <wp:inline distT="0" distB="0" distL="0" distR="0" wp14:anchorId="785C6230" wp14:editId="5FD38873">
+            <wp:extent cx="4844654" cy="2139315"/>
             <wp:effectExtent l="0" t="0" r="0" b="0"/>
             <wp:docPr id="363103209" name="Picture 1"/>
             <wp:cNvGraphicFramePr>
@@ -1238,7 +1297,7 @@
                     <pic:cNvPicPr/>
                   </pic:nvPicPr>
                   <pic:blipFill>
-                    <a:blip r:embed="rId9"/>
+                    <a:blip r:embed="rId12"/>
                     <a:stretch>
                       <a:fillRect/>
                     </a:stretch>
@@ -1246,7 +1305,7 @@
                   <pic:spPr>
                     <a:xfrm>
                       <a:off x="0" y="0"/>
-                      <a:ext cx="5486400" cy="2635250"/>
+                      <a:ext cx="4883609" cy="2156517"/>
                     </a:xfrm>
                     <a:prstGeom prst="rect">
                       <a:avLst/>
@@ -1270,11 +1329,10 @@
         <w:rPr>
           <w:noProof/>
         </w:rPr>
-        <w:lastRenderedPageBreak/>
         <w:drawing>
-          <wp:inline distT="0" distB="0" distL="0" distR="0" wp14:anchorId="147FA36C" wp14:editId="7FCCE8AD">
-            <wp:extent cx="3685309" cy="3835197"/>
-            <wp:effectExtent l="0" t="0" r="0" b="0"/>
+          <wp:inline distT="0" distB="0" distL="0" distR="0" wp14:anchorId="147FA36C" wp14:editId="69632A93">
+            <wp:extent cx="2703797" cy="2470150"/>
+            <wp:effectExtent l="0" t="0" r="1905" b="6350"/>
             <wp:docPr id="751420" name="Picture 1"/>
             <wp:cNvGraphicFramePr>
               <a:graphicFrameLocks xmlns:a="http://schemas.openxmlformats.org/drawingml/2006/main" noChangeAspect="1"/>
@@ -1289,7 +1347,7 @@
                     </pic:cNvPicPr>
                   </pic:nvPicPr>
                   <pic:blipFill>
-                    <a:blip r:embed="rId10">
+                    <a:blip r:embed="rId13">
                       <a:extLst>
                         <a:ext uri="{28A0092B-C50C-407E-A947-70E740481C1C}">
                           <a14:useLocalDpi xmlns:a14="http://schemas.microsoft.com/office/drawing/2010/main" val="0"/>
@@ -1304,7 +1362,7 @@
                   <pic:spPr bwMode="auto">
                     <a:xfrm>
                       <a:off x="0" y="0"/>
-                      <a:ext cx="3694388" cy="3844645"/>
+                      <a:ext cx="2731076" cy="2495072"/>
                     </a:xfrm>
                     <a:prstGeom prst="rect">
                       <a:avLst/>
@@ -1508,6 +1566,7 @@
         <w:rPr>
           <w:lang w:val="en-IN"/>
         </w:rPr>
+        <w:lastRenderedPageBreak/>
         <w:t xml:space="preserve">The business demonstrated strong sales performance with revenue exceeding </w:t>
       </w:r>
       <w:r>
@@ -1567,7 +1626,6 @@
         <w:rPr>
           <w:lang w:val="en-IN"/>
         </w:rPr>
-        <w:lastRenderedPageBreak/>
         <w:t>The findings indicate that Electronics products, particularly Laptops, serve as the primary growth engine of the business, while regional and channel performance remains well distributed, reducing dependency on a single market segment.</w:t>
       </w:r>
     </w:p>
@@ -1698,6 +1756,12 @@
     </w:p>
     <w:p/>
     <w:sectPr>
+      <w:headerReference w:type="even" r:id="rId14"/>
+      <w:headerReference w:type="default" r:id="rId15"/>
+      <w:footerReference w:type="even" r:id="rId16"/>
+      <w:footerReference w:type="default" r:id="rId17"/>
+      <w:headerReference w:type="first" r:id="rId18"/>
+      <w:footerReference w:type="first" r:id="rId19"/>
       <w:pgSz w:w="12240" w:h="15840"/>
       <w:pgMar w:top="1440" w:right="1800" w:bottom="1440" w:left="1800" w:header="720" w:footer="720" w:gutter="0"/>
       <w:cols w:space="720"/>
@@ -1705,6 +1769,159 @@
     </w:sectPr>
   </w:body>
 </w:document>
+</file>
+
+<file path=word/endnotes.xml><?xml version="1.0" encoding="utf-8"?>
+<w:endnotes xmlns:wpc="http://schemas.microsoft.com/office/word/2010/wordprocessingCanvas" xmlns:cx="http://schemas.microsoft.com/office/drawing/2014/chartex" xmlns:cx1="http://schemas.microsoft.com/office/drawing/2015/9/8/chartex" xmlns:cx2="http://schemas.microsoft.com/office/drawing/2015/10/21/chartex" xmlns:cx3="http://schemas.microsoft.com/office/drawing/2016/5/9/chartex" xmlns:cx4="http://schemas.microsoft.com/office/drawing/2016/5/10/chartex" xmlns:cx5="http://schemas.microsoft.com/office/drawing/2016/5/11/chartex" xmlns:cx6="http://schemas.microsoft.com/office/drawing/2016/5/12/chartex" xmlns:cx7="http://schemas.microsoft.com/office/drawing/2016/5/13/chartex" xmlns:cx8="http://schemas.microsoft.com/office/drawing/2016/5/14/chartex" xmlns:mc="http://schemas.openxmlformats.org/markup-compatibility/2006" xmlns:aink="http://schemas.microsoft.com/office/drawing/2016/ink" xmlns:am3d="http://schemas.microsoft.com/office/drawing/2017/model3d" xmlns:o="urn:schemas-microsoft-com:office:office" xmlns:oel="http://schemas.microsoft.com/office/2019/extlst" xmlns:r="http://schemas.openxmlformats.org/officeDocument/2006/relationships" xmlns:m="http://schemas.openxmlformats.org/officeDocument/2006/math" xmlns:v="urn:schemas-microsoft-com:vml" xmlns:wp14="http://schemas.microsoft.com/office/word/2010/wordprocessingDrawing" xmlns:wp="http://schemas.openxmlformats.org/drawingml/2006/wordprocessingDrawing" xmlns:w10="urn:schemas-microsoft-com:office:word" xmlns:w="http://schemas.openxmlformats.org/wordprocessingml/2006/main" xmlns:w14="http://schemas.microsoft.com/office/word/2010/wordml" xmlns:w15="http://schemas.microsoft.com/office/word/2012/wordml" xmlns:w16cex="http://schemas.microsoft.com/office/word/2018/wordml/cex" xmlns:w16cid="http://schemas.microsoft.com/office/word/2016/wordml/cid" xmlns:w16="http://schemas.microsoft.com/office/word/2018/wordml" xmlns:w16du="http://schemas.microsoft.com/office/word/2023/wordml/word16du" xmlns:w16sdtdh="http://schemas.microsoft.com/office/word/2020/wordml/sdtdatahash" xmlns:w16sdtfl="http://schemas.microsoft.com/office/word/2024/wordml/sdtformatlock" xmlns:w16se="http://schemas.microsoft.com/office/word/2015/wordml/symex" xmlns:wpg="http://schemas.microsoft.com/office/word/2010/wordprocessingGroup" xmlns:wpi="http://schemas.microsoft.com/office/word/2010/wordprocessingInk" xmlns:wne="http://schemas.microsoft.com/office/word/2006/wordml" xmlns:wps="http://schemas.microsoft.com/office/word/2010/wordprocessingShape" mc:Ignorable="w14 w15 w16se w16cid w16 w16cex w16sdtdh w16sdtfl w16du wp14">
+  <w:endnote w:type="separator" w:id="-1">
+    <w:p>
+      <w:pPr>
+        <w:spacing w:after="0" w:line="240" w:lineRule="auto"/>
+      </w:pPr>
+      <w:r>
+        <w:separator/>
+      </w:r>
+    </w:p>
+  </w:endnote>
+  <w:endnote w:type="continuationSeparator" w:id="0">
+    <w:p>
+      <w:pPr>
+        <w:spacing w:after="0" w:line="240" w:lineRule="auto"/>
+      </w:pPr>
+      <w:r>
+        <w:continuationSeparator/>
+      </w:r>
+    </w:p>
+  </w:endnote>
+</w:endnotes>
+</file>
+
+<file path=word/footer1.xml><?xml version="1.0" encoding="utf-8"?>
+<w:ftr xmlns:wpc="http://schemas.microsoft.com/office/word/2010/wordprocessingCanvas" xmlns:cx="http://schemas.microsoft.com/office/drawing/2014/chartex" xmlns:cx1="http://schemas.microsoft.com/office/drawing/2015/9/8/chartex" xmlns:cx2="http://schemas.microsoft.com/office/drawing/2015/10/21/chartex" xmlns:cx3="http://schemas.microsoft.com/office/drawing/2016/5/9/chartex" xmlns:cx4="http://schemas.microsoft.com/office/drawing/2016/5/10/chartex" xmlns:cx5="http://schemas.microsoft.com/office/drawing/2016/5/11/chartex" xmlns:cx6="http://schemas.microsoft.com/office/drawing/2016/5/12/chartex" xmlns:cx7="http://schemas.microsoft.com/office/drawing/2016/5/13/chartex" xmlns:cx8="http://schemas.microsoft.com/office/drawing/2016/5/14/chartex" xmlns:mc="http://schemas.openxmlformats.org/markup-compatibility/2006" xmlns:aink="http://schemas.microsoft.com/office/drawing/2016/ink" xmlns:am3d="http://schemas.microsoft.com/office/drawing/2017/model3d" xmlns:o="urn:schemas-microsoft-com:office:office" xmlns:oel="http://schemas.microsoft.com/office/2019/extlst" xmlns:r="http://schemas.openxmlformats.org/officeDocument/2006/relationships" xmlns:m="http://schemas.openxmlformats.org/officeDocument/2006/math" xmlns:v="urn:schemas-microsoft-com:vml" xmlns:wp14="http://schemas.microsoft.com/office/word/2010/wordprocessingDrawing" xmlns:wp="http://schemas.openxmlformats.org/drawingml/2006/wordprocessingDrawing" xmlns:w10="urn:schemas-microsoft-com:office:word" xmlns:w="http://schemas.openxmlformats.org/wordprocessingml/2006/main" xmlns:w14="http://schemas.microsoft.com/office/word/2010/wordml" xmlns:w15="http://schemas.microsoft.com/office/word/2012/wordml" xmlns:w16cex="http://schemas.microsoft.com/office/word/2018/wordml/cex" xmlns:w16cid="http://schemas.microsoft.com/office/word/2016/wordml/cid" xmlns:w16="http://schemas.microsoft.com/office/word/2018/wordml" xmlns:w16du="http://schemas.microsoft.com/office/word/2023/wordml/word16du" xmlns:w16sdtdh="http://schemas.microsoft.com/office/word/2020/wordml/sdtdatahash" xmlns:w16sdtfl="http://schemas.microsoft.com/office/word/2024/wordml/sdtformatlock" xmlns:w16se="http://schemas.microsoft.com/office/word/2015/wordml/symex" xmlns:wpg="http://schemas.microsoft.com/office/word/2010/wordprocessingGroup" xmlns:wpi="http://schemas.microsoft.com/office/word/2010/wordprocessingInk" xmlns:wne="http://schemas.microsoft.com/office/word/2006/wordml" xmlns:wps="http://schemas.microsoft.com/office/word/2010/wordprocessingShape" mc:Ignorable="w14 w15 w16se w16cid w16 w16cex w16sdtdh w16sdtfl w16du wp14">
+  <w:p>
+    <w:pPr>
+      <w:pStyle w:val="Footer"/>
+    </w:pPr>
+  </w:p>
+</w:ftr>
+</file>
+
+<file path=word/footer2.xml><?xml version="1.0" encoding="utf-8"?>
+<w:ftr xmlns:wpc="http://schemas.microsoft.com/office/word/2010/wordprocessingCanvas" xmlns:cx="http://schemas.microsoft.com/office/drawing/2014/chartex" xmlns:cx1="http://schemas.microsoft.com/office/drawing/2015/9/8/chartex" xmlns:cx2="http://schemas.microsoft.com/office/drawing/2015/10/21/chartex" xmlns:cx3="http://schemas.microsoft.com/office/drawing/2016/5/9/chartex" xmlns:cx4="http://schemas.microsoft.com/office/drawing/2016/5/10/chartex" xmlns:cx5="http://schemas.microsoft.com/office/drawing/2016/5/11/chartex" xmlns:cx6="http://schemas.microsoft.com/office/drawing/2016/5/12/chartex" xmlns:cx7="http://schemas.microsoft.com/office/drawing/2016/5/13/chartex" xmlns:cx8="http://schemas.microsoft.com/office/drawing/2016/5/14/chartex" xmlns:mc="http://schemas.openxmlformats.org/markup-compatibility/2006" xmlns:aink="http://schemas.microsoft.com/office/drawing/2016/ink" xmlns:am3d="http://schemas.microsoft.com/office/drawing/2017/model3d" xmlns:o="urn:schemas-microsoft-com:office:office" xmlns:oel="http://schemas.microsoft.com/office/2019/extlst" xmlns:r="http://schemas.openxmlformats.org/officeDocument/2006/relationships" xmlns:m="http://schemas.openxmlformats.org/officeDocument/2006/math" xmlns:v="urn:schemas-microsoft-com:vml" xmlns:wp14="http://schemas.microsoft.com/office/word/2010/wordprocessingDrawing" xmlns:wp="http://schemas.openxmlformats.org/drawingml/2006/wordprocessingDrawing" xmlns:w10="urn:schemas-microsoft-com:office:word" xmlns:w="http://schemas.openxmlformats.org/wordprocessingml/2006/main" xmlns:w14="http://schemas.microsoft.com/office/word/2010/wordml" xmlns:w15="http://schemas.microsoft.com/office/word/2012/wordml" xmlns:w16cex="http://schemas.microsoft.com/office/word/2018/wordml/cex" xmlns:w16cid="http://schemas.microsoft.com/office/word/2016/wordml/cid" xmlns:w16="http://schemas.microsoft.com/office/word/2018/wordml" xmlns:w16du="http://schemas.microsoft.com/office/word/2023/wordml/word16du" xmlns:w16sdtdh="http://schemas.microsoft.com/office/word/2020/wordml/sdtdatahash" xmlns:w16sdtfl="http://schemas.microsoft.com/office/word/2024/wordml/sdtformatlock" xmlns:w16se="http://schemas.microsoft.com/office/word/2015/wordml/symex" xmlns:wpg="http://schemas.microsoft.com/office/word/2010/wordprocessingGroup" xmlns:wpi="http://schemas.microsoft.com/office/word/2010/wordprocessingInk" xmlns:wne="http://schemas.microsoft.com/office/word/2006/wordml" xmlns:wps="http://schemas.microsoft.com/office/word/2010/wordprocessingShape" mc:Ignorable="w14 w15 w16se w16cid w16 w16cex w16sdtdh w16sdtfl w16du wp14">
+  <w:sdt>
+    <w:sdtPr>
+      <w:id w:val="-1749883260"/>
+      <w:docPartObj>
+        <w:docPartGallery w:val="Page Numbers (Bottom of Page)"/>
+        <w:docPartUnique/>
+      </w:docPartObj>
+    </w:sdtPr>
+    <w:sdtEndPr>
+      <w:rPr>
+        <w:noProof/>
+      </w:rPr>
+    </w:sdtEndPr>
+    <w:sdtContent>
+      <w:p>
+        <w:pPr>
+          <w:pStyle w:val="Footer"/>
+          <w:jc w:val="center"/>
+        </w:pPr>
+        <w:r>
+          <w:fldChar w:fldCharType="begin"/>
+        </w:r>
+        <w:r>
+          <w:instrText xml:space="preserve"> PAGE   \* MERGEFORMAT </w:instrText>
+        </w:r>
+        <w:r>
+          <w:fldChar w:fldCharType="separate"/>
+        </w:r>
+        <w:r>
+          <w:rPr>
+            <w:noProof/>
+          </w:rPr>
+          <w:t>2</w:t>
+        </w:r>
+        <w:r>
+          <w:rPr>
+            <w:noProof/>
+          </w:rPr>
+          <w:fldChar w:fldCharType="end"/>
+        </w:r>
+      </w:p>
+    </w:sdtContent>
+  </w:sdt>
+  <w:p>
+    <w:pPr>
+      <w:pStyle w:val="Footer"/>
+    </w:pPr>
+  </w:p>
+</w:ftr>
+</file>
+
+<file path=word/footer3.xml><?xml version="1.0" encoding="utf-8"?>
+<w:ftr xmlns:wpc="http://schemas.microsoft.com/office/word/2010/wordprocessingCanvas" xmlns:cx="http://schemas.microsoft.com/office/drawing/2014/chartex" xmlns:cx1="http://schemas.microsoft.com/office/drawing/2015/9/8/chartex" xmlns:cx2="http://schemas.microsoft.com/office/drawing/2015/10/21/chartex" xmlns:cx3="http://schemas.microsoft.com/office/drawing/2016/5/9/chartex" xmlns:cx4="http://schemas.microsoft.com/office/drawing/2016/5/10/chartex" xmlns:cx5="http://schemas.microsoft.com/office/drawing/2016/5/11/chartex" xmlns:cx6="http://schemas.microsoft.com/office/drawing/2016/5/12/chartex" xmlns:cx7="http://schemas.microsoft.com/office/drawing/2016/5/13/chartex" xmlns:cx8="http://schemas.microsoft.com/office/drawing/2016/5/14/chartex" xmlns:mc="http://schemas.openxmlformats.org/markup-compatibility/2006" xmlns:aink="http://schemas.microsoft.com/office/drawing/2016/ink" xmlns:am3d="http://schemas.microsoft.com/office/drawing/2017/model3d" xmlns:o="urn:schemas-microsoft-com:office:office" xmlns:oel="http://schemas.microsoft.com/office/2019/extlst" xmlns:r="http://schemas.openxmlformats.org/officeDocument/2006/relationships" xmlns:m="http://schemas.openxmlformats.org/officeDocument/2006/math" xmlns:v="urn:schemas-microsoft-com:vml" xmlns:wp14="http://schemas.microsoft.com/office/word/2010/wordprocessingDrawing" xmlns:wp="http://schemas.openxmlformats.org/drawingml/2006/wordprocessingDrawing" xmlns:w10="urn:schemas-microsoft-com:office:word" xmlns:w="http://schemas.openxmlformats.org/wordprocessingml/2006/main" xmlns:w14="http://schemas.microsoft.com/office/word/2010/wordml" xmlns:w15="http://schemas.microsoft.com/office/word/2012/wordml" xmlns:w16cex="http://schemas.microsoft.com/office/word/2018/wordml/cex" xmlns:w16cid="http://schemas.microsoft.com/office/word/2016/wordml/cid" xmlns:w16="http://schemas.microsoft.com/office/word/2018/wordml" xmlns:w16du="http://schemas.microsoft.com/office/word/2023/wordml/word16du" xmlns:w16sdtdh="http://schemas.microsoft.com/office/word/2020/wordml/sdtdatahash" xmlns:w16sdtfl="http://schemas.microsoft.com/office/word/2024/wordml/sdtformatlock" xmlns:w16se="http://schemas.microsoft.com/office/word/2015/wordml/symex" xmlns:wpg="http://schemas.microsoft.com/office/word/2010/wordprocessingGroup" xmlns:wpi="http://schemas.microsoft.com/office/word/2010/wordprocessingInk" xmlns:wne="http://schemas.microsoft.com/office/word/2006/wordml" xmlns:wps="http://schemas.microsoft.com/office/word/2010/wordprocessingShape" mc:Ignorable="w14 w15 w16se w16cid w16 w16cex w16sdtdh w16sdtfl w16du wp14">
+  <w:p>
+    <w:pPr>
+      <w:pStyle w:val="Footer"/>
+    </w:pPr>
+  </w:p>
+</w:ftr>
+</file>
+
+<file path=word/footnotes.xml><?xml version="1.0" encoding="utf-8"?>
+<w:footnotes xmlns:wpc="http://schemas.microsoft.com/office/word/2010/wordprocessingCanvas" xmlns:cx="http://schemas.microsoft.com/office/drawing/2014/chartex" xmlns:cx1="http://schemas.microsoft.com/office/drawing/2015/9/8/chartex" xmlns:cx2="http://schemas.microsoft.com/office/drawing/2015/10/21/chartex" xmlns:cx3="http://schemas.microsoft.com/office/drawing/2016/5/9/chartex" xmlns:cx4="http://schemas.microsoft.com/office/drawing/2016/5/10/chartex" xmlns:cx5="http://schemas.microsoft.com/office/drawing/2016/5/11/chartex" xmlns:cx6="http://schemas.microsoft.com/office/drawing/2016/5/12/chartex" xmlns:cx7="http://schemas.microsoft.com/office/drawing/2016/5/13/chartex" xmlns:cx8="http://schemas.microsoft.com/office/drawing/2016/5/14/chartex" xmlns:mc="http://schemas.openxmlformats.org/markup-compatibility/2006" xmlns:aink="http://schemas.microsoft.com/office/drawing/2016/ink" xmlns:am3d="http://schemas.microsoft.com/office/drawing/2017/model3d" xmlns:o="urn:schemas-microsoft-com:office:office" xmlns:oel="http://schemas.microsoft.com/office/2019/extlst" xmlns:r="http://schemas.openxmlformats.org/officeDocument/2006/relationships" xmlns:m="http://schemas.openxmlformats.org/officeDocument/2006/math" xmlns:v="urn:schemas-microsoft-com:vml" xmlns:wp14="http://schemas.microsoft.com/office/word/2010/wordprocessingDrawing" xmlns:wp="http://schemas.openxmlformats.org/drawingml/2006/wordprocessingDrawing" xmlns:w10="urn:schemas-microsoft-com:office:word" xmlns:w="http://schemas.openxmlformats.org/wordprocessingml/2006/main" xmlns:w14="http://schemas.microsoft.com/office/word/2010/wordml" xmlns:w15="http://schemas.microsoft.com/office/word/2012/wordml" xmlns:w16cex="http://schemas.microsoft.com/office/word/2018/wordml/cex" xmlns:w16cid="http://schemas.microsoft.com/office/word/2016/wordml/cid" xmlns:w16="http://schemas.microsoft.com/office/word/2018/wordml" xmlns:w16du="http://schemas.microsoft.com/office/word/2023/wordml/word16du" xmlns:w16sdtdh="http://schemas.microsoft.com/office/word/2020/wordml/sdtdatahash" xmlns:w16sdtfl="http://schemas.microsoft.com/office/word/2024/wordml/sdtformatlock" xmlns:w16se="http://schemas.microsoft.com/office/word/2015/wordml/symex" xmlns:wpg="http://schemas.microsoft.com/office/word/2010/wordprocessingGroup" xmlns:wpi="http://schemas.microsoft.com/office/word/2010/wordprocessingInk" xmlns:wne="http://schemas.microsoft.com/office/word/2006/wordml" xmlns:wps="http://schemas.microsoft.com/office/word/2010/wordprocessingShape" mc:Ignorable="w14 w15 w16se w16cid w16 w16cex w16sdtdh w16sdtfl w16du wp14">
+  <w:footnote w:type="separator" w:id="-1">
+    <w:p>
+      <w:pPr>
+        <w:spacing w:after="0" w:line="240" w:lineRule="auto"/>
+      </w:pPr>
+      <w:r>
+        <w:separator/>
+      </w:r>
+    </w:p>
+  </w:footnote>
+  <w:footnote w:type="continuationSeparator" w:id="0">
+    <w:p>
+      <w:pPr>
+        <w:spacing w:after="0" w:line="240" w:lineRule="auto"/>
+      </w:pPr>
+      <w:r>
+        <w:continuationSeparator/>
+      </w:r>
+    </w:p>
+  </w:footnote>
+</w:footnotes>
+</file>
+
+<file path=word/header1.xml><?xml version="1.0" encoding="utf-8"?>
+<w:hdr xmlns:wpc="http://schemas.microsoft.com/office/word/2010/wordprocessingCanvas" xmlns:cx="http://schemas.microsoft.com/office/drawing/2014/chartex" xmlns:cx1="http://schemas.microsoft.com/office/drawing/2015/9/8/chartex" xmlns:cx2="http://schemas.microsoft.com/office/drawing/2015/10/21/chartex" xmlns:cx3="http://schemas.microsoft.com/office/drawing/2016/5/9/chartex" xmlns:cx4="http://schemas.microsoft.com/office/drawing/2016/5/10/chartex" xmlns:cx5="http://schemas.microsoft.com/office/drawing/2016/5/11/chartex" xmlns:cx6="http://schemas.microsoft.com/office/drawing/2016/5/12/chartex" xmlns:cx7="http://schemas.microsoft.com/office/drawing/2016/5/13/chartex" xmlns:cx8="http://schemas.microsoft.com/office/drawing/2016/5/14/chartex" xmlns:mc="http://schemas.openxmlformats.org/markup-compatibility/2006" xmlns:aink="http://schemas.microsoft.com/office/drawing/2016/ink" xmlns:am3d="http://schemas.microsoft.com/office/drawing/2017/model3d" xmlns:o="urn:schemas-microsoft-com:office:office" xmlns:oel="http://schemas.microsoft.com/office/2019/extlst" xmlns:r="http://schemas.openxmlformats.org/officeDocument/2006/relationships" xmlns:m="http://schemas.openxmlformats.org/officeDocument/2006/math" xmlns:v="urn:schemas-microsoft-com:vml" xmlns:wp14="http://schemas.microsoft.com/office/word/2010/wordprocessingDrawing" xmlns:wp="http://schemas.openxmlformats.org/drawingml/2006/wordprocessingDrawing" xmlns:w10="urn:schemas-microsoft-com:office:word" xmlns:w="http://schemas.openxmlformats.org/wordprocessingml/2006/main" xmlns:w14="http://schemas.microsoft.com/office/word/2010/wordml" xmlns:w15="http://schemas.microsoft.com/office/word/2012/wordml" xmlns:w16cex="http://schemas.microsoft.com/office/word/2018/wordml/cex" xmlns:w16cid="http://schemas.microsoft.com/office/word/2016/wordml/cid" xmlns:w16="http://schemas.microsoft.com/office/word/2018/wordml" xmlns:w16du="http://schemas.microsoft.com/office/word/2023/wordml/word16du" xmlns:w16sdtdh="http://schemas.microsoft.com/office/word/2020/wordml/sdtdatahash" xmlns:w16sdtfl="http://schemas.microsoft.com/office/word/2024/wordml/sdtformatlock" xmlns:w16se="http://schemas.microsoft.com/office/word/2015/wordml/symex" xmlns:wpg="http://schemas.microsoft.com/office/word/2010/wordprocessingGroup" xmlns:wpi="http://schemas.microsoft.com/office/word/2010/wordprocessingInk" xmlns:wne="http://schemas.microsoft.com/office/word/2006/wordml" xmlns:wps="http://schemas.microsoft.com/office/word/2010/wordprocessingShape" mc:Ignorable="w14 w15 w16se w16cid w16 w16cex w16sdtdh w16sdtfl w16du wp14">
+  <w:p>
+    <w:pPr>
+      <w:pStyle w:val="Header"/>
+    </w:pPr>
+  </w:p>
+</w:hdr>
+</file>
+
+<file path=word/header2.xml><?xml version="1.0" encoding="utf-8"?>
+<w:hdr xmlns:wpc="http://schemas.microsoft.com/office/word/2010/wordprocessingCanvas" xmlns:cx="http://schemas.microsoft.com/office/drawing/2014/chartex" xmlns:cx1="http://schemas.microsoft.com/office/drawing/2015/9/8/chartex" xmlns:cx2="http://schemas.microsoft.com/office/drawing/2015/10/21/chartex" xmlns:cx3="http://schemas.microsoft.com/office/drawing/2016/5/9/chartex" xmlns:cx4="http://schemas.microsoft.com/office/drawing/2016/5/10/chartex" xmlns:cx5="http://schemas.microsoft.com/office/drawing/2016/5/11/chartex" xmlns:cx6="http://schemas.microsoft.com/office/drawing/2016/5/12/chartex" xmlns:cx7="http://schemas.microsoft.com/office/drawing/2016/5/13/chartex" xmlns:cx8="http://schemas.microsoft.com/office/drawing/2016/5/14/chartex" xmlns:mc="http://schemas.openxmlformats.org/markup-compatibility/2006" xmlns:aink="http://schemas.microsoft.com/office/drawing/2016/ink" xmlns:am3d="http://schemas.microsoft.com/office/drawing/2017/model3d" xmlns:o="urn:schemas-microsoft-com:office:office" xmlns:oel="http://schemas.microsoft.com/office/2019/extlst" xmlns:r="http://schemas.openxmlformats.org/officeDocument/2006/relationships" xmlns:m="http://schemas.openxmlformats.org/officeDocument/2006/math" xmlns:v="urn:schemas-microsoft-com:vml" xmlns:wp14="http://schemas.microsoft.com/office/word/2010/wordprocessingDrawing" xmlns:wp="http://schemas.openxmlformats.org/drawingml/2006/wordprocessingDrawing" xmlns:w10="urn:schemas-microsoft-com:office:word" xmlns:w="http://schemas.openxmlformats.org/wordprocessingml/2006/main" xmlns:w14="http://schemas.microsoft.com/office/word/2010/wordml" xmlns:w15="http://schemas.microsoft.com/office/word/2012/wordml" xmlns:w16cex="http://schemas.microsoft.com/office/word/2018/wordml/cex" xmlns:w16cid="http://schemas.microsoft.com/office/word/2016/wordml/cid" xmlns:w16="http://schemas.microsoft.com/office/word/2018/wordml" xmlns:w16du="http://schemas.microsoft.com/office/word/2023/wordml/word16du" xmlns:w16sdtdh="http://schemas.microsoft.com/office/word/2020/wordml/sdtdatahash" xmlns:w16sdtfl="http://schemas.microsoft.com/office/word/2024/wordml/sdtformatlock" xmlns:w16se="http://schemas.microsoft.com/office/word/2015/wordml/symex" xmlns:wpg="http://schemas.microsoft.com/office/word/2010/wordprocessingGroup" xmlns:wpi="http://schemas.microsoft.com/office/word/2010/wordprocessingInk" xmlns:wne="http://schemas.microsoft.com/office/word/2006/wordml" xmlns:wps="http://schemas.microsoft.com/office/word/2010/wordprocessingShape" mc:Ignorable="w14 w15 w16se w16cid w16 w16cex w16sdtdh w16sdtfl w16du wp14">
+  <w:p>
+    <w:pPr>
+      <w:pStyle w:val="Header"/>
+    </w:pPr>
+  </w:p>
+</w:hdr>
+</file>
+
+<file path=word/header3.xml><?xml version="1.0" encoding="utf-8"?>
+<w:hdr xmlns:wpc="http://schemas.microsoft.com/office/word/2010/wordprocessingCanvas" xmlns:cx="http://schemas.microsoft.com/office/drawing/2014/chartex" xmlns:cx1="http://schemas.microsoft.com/office/drawing/2015/9/8/chartex" xmlns:cx2="http://schemas.microsoft.com/office/drawing/2015/10/21/chartex" xmlns:cx3="http://schemas.microsoft.com/office/drawing/2016/5/9/chartex" xmlns:cx4="http://schemas.microsoft.com/office/drawing/2016/5/10/chartex" xmlns:cx5="http://schemas.microsoft.com/office/drawing/2016/5/11/chartex" xmlns:cx6="http://schemas.microsoft.com/office/drawing/2016/5/12/chartex" xmlns:cx7="http://schemas.microsoft.com/office/drawing/2016/5/13/chartex" xmlns:cx8="http://schemas.microsoft.com/office/drawing/2016/5/14/chartex" xmlns:mc="http://schemas.openxmlformats.org/markup-compatibility/2006" xmlns:aink="http://schemas.microsoft.com/office/drawing/2016/ink" xmlns:am3d="http://schemas.microsoft.com/office/drawing/2017/model3d" xmlns:o="urn:schemas-microsoft-com:office:office" xmlns:oel="http://schemas.microsoft.com/office/2019/extlst" xmlns:r="http://schemas.openxmlformats.org/officeDocument/2006/relationships" xmlns:m="http://schemas.openxmlformats.org/officeDocument/2006/math" xmlns:v="urn:schemas-microsoft-com:vml" xmlns:wp14="http://schemas.microsoft.com/office/word/2010/wordprocessingDrawing" xmlns:wp="http://schemas.openxmlformats.org/drawingml/2006/wordprocessingDrawing" xmlns:w10="urn:schemas-microsoft-com:office:word" xmlns:w="http://schemas.openxmlformats.org/wordprocessingml/2006/main" xmlns:w14="http://schemas.microsoft.com/office/word/2010/wordml" xmlns:w15="http://schemas.microsoft.com/office/word/2012/wordml" xmlns:w16cex="http://schemas.microsoft.com/office/word/2018/wordml/cex" xmlns:w16cid="http://schemas.microsoft.com/office/word/2016/wordml/cid" xmlns:w16="http://schemas.microsoft.com/office/word/2018/wordml" xmlns:w16du="http://schemas.microsoft.com/office/word/2023/wordml/word16du" xmlns:w16sdtdh="http://schemas.microsoft.com/office/word/2020/wordml/sdtdatahash" xmlns:w16sdtfl="http://schemas.microsoft.com/office/word/2024/wordml/sdtformatlock" xmlns:w16se="http://schemas.microsoft.com/office/word/2015/wordml/symex" xmlns:wpg="http://schemas.microsoft.com/office/word/2010/wordprocessingGroup" xmlns:wpi="http://schemas.microsoft.com/office/word/2010/wordprocessingInk" xmlns:wne="http://schemas.microsoft.com/office/word/2006/wordml" xmlns:wps="http://schemas.microsoft.com/office/word/2010/wordprocessingShape" mc:Ignorable="w14 w15 w16se w16cid w16 w16cex w16sdtdh w16sdtfl w16du wp14">
+  <w:p>
+    <w:pPr>
+      <w:pStyle w:val="Header"/>
+    </w:pPr>
+  </w:p>
+</w:hdr>
 </file>
 
 <file path=word/numbering.xml><?xml version="1.0" encoding="utf-8"?>
@@ -4193,6 +4410,7 @@
   <w:style w:type="character" w:default="1" w:styleId="DefaultParagraphFont">
     <w:name w:val="Default Paragraph Font"/>
     <w:uiPriority w:val="1"/>
+    <w:semiHidden/>
     <w:unhideWhenUsed/>
   </w:style>
   <w:style w:type="table" w:default="1" w:styleId="TableNormal">

</xml_diff>